<commit_message>
Mettre à jour les documents après unification des comptes
Co-authored-by: HB consulting and services  <hb.consulting.srv@gmail.com>
</commit_message>
<xml_diff>
--- a/docs/cahier-des-charges-hb-commerce.docx
+++ b/docs/cahier-des-charges-hb-commerce.docx
@@ -47,7 +47,7 @@
       <w:pPr/>
       <w:r>
         <w:rPr/>
-        <w:t xml:space="preserve">Dernière modification : mise à jour fournisseurs, stock, factures, livraison, agents commerciaux</w:t>
+        <w:t xml:space="preserve">Dernière modification : création unifiée sociétés/utilisateurs internes, fournisseurs, stock, factures et livraison</w:t>
       </w:r>
     </w:p>
     <w:p>
@@ -260,7 +260,69 @@
             <w:pPr/>
             <w:r>
               <w:rPr/>
-              <w:t xml:space="preserve">Ajout gestion fournisseurs, espace fournisseur, stock, commandes fournisseur, factures et suivi livraison</w:t>
+              <w:t xml:space="preserve">Ajout agents, fournisseurs, stock, factures, livraison</w:t>
+            </w:r>
+          </w:p>
+        </w:tc>
+        <w:tc>
+          <w:tcPr>
+            <w:tcW w:w="1500" w:type="dxa"/>
+          </w:tcPr>
+          <w:p>
+            <w:pPr/>
+            <w:r>
+              <w:rPr/>
+              <w:t xml:space="preserve">Réalisé</w:t>
+            </w:r>
+          </w:p>
+        </w:tc>
+      </w:tr>
+      <w:tr>
+        <w:tc>
+          <w:tcPr>
+            <w:tcW w:w="1000" w:type="dxa"/>
+          </w:tcPr>
+          <w:p>
+            <w:pPr/>
+            <w:r>
+              <w:rPr/>
+              <w:t xml:space="preserve">1.2</w:t>
+            </w:r>
+          </w:p>
+        </w:tc>
+        <w:tc>
+          <w:tcPr>
+            <w:tcW w:w="1400" w:type="dxa"/>
+          </w:tcPr>
+          <w:p>
+            <w:pPr/>
+            <w:r>
+              <w:rPr/>
+              <w:t xml:space="preserve">18/06/2026</w:t>
+            </w:r>
+          </w:p>
+        </w:tc>
+        <w:tc>
+          <w:tcPr>
+            <w:tcW w:w="2100" w:type="dxa"/>
+          </w:tcPr>
+          <w:p>
+            <w:pPr/>
+            <w:r>
+              <w:rPr/>
+              <w:t xml:space="preserve">Cursor Cloud Agent</w:t>
+            </w:r>
+          </w:p>
+        </w:tc>
+        <w:tc>
+          <w:tcPr>
+            <w:tcW w:w="4700" w:type="dxa"/>
+          </w:tcPr>
+          <w:p>
+            <w:pPr/>
+            <w:r>
+              <w:rPr/>
+              <w:t xml:space="preserve">Création unifiée société client/fournisseur et utilisateurs internes HB Commerce</w:t>
             </w:r>
           </w:p>
         </w:tc>
@@ -491,7 +553,7 @@
             <w:pPr/>
             <w:r>
               <w:rPr/>
-              <w:t xml:space="preserve">Produit principal</w:t>
+              <w:t xml:space="preserve">Document</w:t>
             </w:r>
           </w:p>
         </w:tc>
@@ -503,7 +565,7 @@
             <w:pPr/>
             <w:r>
               <w:rPr/>
-              <w:t xml:space="preserve">FIAFI - huile d’olive extra vierge</w:t>
+              <w:t xml:space="preserve">Cahier des charges fonctionnel et technique</w:t>
             </w:r>
           </w:p>
         </w:tc>
@@ -548,63 +610,70 @@
       <w:pPr/>
       <w:r>
         <w:rPr/>
-        <w:t xml:space="preserve">4. Parcours client société</w:t>
-      </w:r>
-    </w:p>
-    <w:p>
-      <w:pPr/>
-      <w:r>
-        <w:rPr/>
-        <w:t xml:space="preserve">5. Agents commerciaux</w:t>
-      </w:r>
-    </w:p>
-    <w:p>
-      <w:pPr/>
-      <w:r>
-        <w:rPr/>
-        <w:t xml:space="preserve">6. Fournisseurs, stock et approvisionnement</w:t>
-      </w:r>
-    </w:p>
-    <w:p>
-      <w:pPr/>
-      <w:r>
-        <w:rPr/>
-        <w:t xml:space="preserve">7. Commandes, paiements, factures et livraison</w:t>
-      </w:r>
-    </w:p>
-    <w:p>
-      <w:pPr/>
-      <w:r>
-        <w:rPr/>
-        <w:t xml:space="preserve">8. Chat, modération et prix personnalisés</w:t>
-      </w:r>
-    </w:p>
-    <w:p>
-      <w:pPr/>
-      <w:r>
-        <w:rPr/>
-        <w:t xml:space="preserve">9. Dashboards</w:t>
-      </w:r>
-    </w:p>
-    <w:p>
-      <w:pPr/>
-      <w:r>
-        <w:rPr/>
-        <w:t xml:space="preserve">10. Données Supabase et sécurité</w:t>
-      </w:r>
-    </w:p>
-    <w:p>
-      <w:pPr/>
-      <w:r>
-        <w:rPr/>
-        <w:t xml:space="preserve">11. Migrations et déploiement</w:t>
-      </w:r>
-    </w:p>
-    <w:p>
-      <w:pPr/>
-      <w:r>
-        <w:rPr/>
-        <w:t xml:space="preserve">12. Critères d’acceptation</w:t>
+        <w:t xml:space="preserve">4. Création des sociétés et utilisateurs internes</w:t>
+      </w:r>
+    </w:p>
+    <w:p>
+      <w:pPr/>
+      <w:r>
+        <w:rPr/>
+        <w:t xml:space="preserve">5. Parcours client société</w:t>
+      </w:r>
+    </w:p>
+    <w:p>
+      <w:pPr/>
+      <w:r>
+        <w:rPr/>
+        <w:t xml:space="preserve">6. Agents commerciaux</w:t>
+      </w:r>
+    </w:p>
+    <w:p>
+      <w:pPr/>
+      <w:r>
+        <w:rPr/>
+        <w:t xml:space="preserve">7. Fournisseurs, stock et approvisionnement</w:t>
+      </w:r>
+    </w:p>
+    <w:p>
+      <w:pPr/>
+      <w:r>
+        <w:rPr/>
+        <w:t xml:space="preserve">8. Commandes, paiements, factures et livraison</w:t>
+      </w:r>
+    </w:p>
+    <w:p>
+      <w:pPr/>
+      <w:r>
+        <w:rPr/>
+        <w:t xml:space="preserve">9. Chat, modération et prix personnalisés</w:t>
+      </w:r>
+    </w:p>
+    <w:p>
+      <w:pPr/>
+      <w:r>
+        <w:rPr/>
+        <w:t xml:space="preserve">10. Dashboards</w:t>
+      </w:r>
+    </w:p>
+    <w:p>
+      <w:pPr/>
+      <w:r>
+        <w:rPr/>
+        <w:t xml:space="preserve">11. Données Supabase et sécurité</w:t>
+      </w:r>
+    </w:p>
+    <w:p>
+      <w:pPr/>
+      <w:r>
+        <w:rPr/>
+        <w:t xml:space="preserve">12. Migrations et déploiement</w:t>
+      </w:r>
+    </w:p>
+    <w:p>
+      <w:pPr/>
+      <w:r>
+        <w:rPr/>
+        <w:t xml:space="preserve">13. Critères d’acceptation</w:t>
       </w:r>
     </w:p>
     <w:p>
@@ -626,23 +695,23 @@
         <w:pStyle w:val="ListBullet"/>
       </w:pPr>
       <w:r>
-        <w:t xml:space="preserve">Mettre à disposition une plateforme e-commerce B2B pour HB Commerce.</w:t>
-      </w:r>
-    </w:p>
-    <w:p>
-      <w:pPr>
-        <w:pStyle w:val="ListBullet"/>
-      </w:pPr>
-      <w:r>
-        <w:t xml:space="preserve">Distribuer FIAFI auprès de clients professionnels en France et au Luxembourg.</w:t>
-      </w:r>
-    </w:p>
-    <w:p>
-      <w:pPr>
-        <w:pStyle w:val="ListBullet"/>
-      </w:pPr>
-      <w:r>
-        <w:t xml:space="preserve">Centraliser commandes, prix personnalisés, chat, factures, livraison, fournisseurs et stock.</w:t>
+        <w:t xml:space="preserve">Plateforme B2B pour la distribution des produits FIAFI par HB Commerce.</w:t>
+      </w:r>
+    </w:p>
+    <w:p>
+      <w:pPr>
+        <w:pStyle w:val="ListBullet"/>
+      </w:pPr>
+      <w:r>
+        <w:t xml:space="preserve">Centraliser catalogue, commandes, clients, fournisseurs, stock, prix personnalisés, factures et livraison.</w:t>
+      </w:r>
+    </w:p>
+    <w:p>
+      <w:pPr>
+        <w:pStyle w:val="ListBullet"/>
+      </w:pPr>
+      <w:r>
+        <w:t xml:space="preserve">Assurer un back-office par rôle avec droits séparés.</w:t>
       </w:r>
     </w:p>
     <w:p>
@@ -666,39 +735,47 @@
         <w:pStyle w:val="ListBullet"/>
       </w:pPr>
       <w:r>
-        <w:t xml:space="preserve">Site vitrine public et catalogue produits.</w:t>
-      </w:r>
-    </w:p>
-    <w:p>
-      <w:pPr>
-        <w:pStyle w:val="ListBullet"/>
-      </w:pPr>
-      <w:r>
-        <w:t xml:space="preserve">Espace client société avec profil, commandes, factures, chat, suivi livraison.</w:t>
-      </w:r>
-    </w:p>
-    <w:p>
-      <w:pPr>
-        <w:pStyle w:val="ListBullet"/>
-      </w:pPr>
-      <w:r>
-        <w:t xml:space="preserve">Dashboard admin et agent commercial.</w:t>
-      </w:r>
-    </w:p>
-    <w:p>
-      <w:pPr>
-        <w:pStyle w:val="ListBullet"/>
-      </w:pPr>
-      <w:r>
-        <w:t xml:space="preserve">Dashboard super root pour rôles, accès et prix.</w:t>
-      </w:r>
-    </w:p>
-    <w:p>
-      <w:pPr>
-        <w:pStyle w:val="ListBullet"/>
-      </w:pPr>
-      <w:r>
-        <w:t xml:space="preserve">Espace fournisseur pour stock et commandes d’approvisionnement.</w:t>
+        <w:t xml:space="preserve">Site public et catalogue professionnel.</w:t>
+      </w:r>
+    </w:p>
+    <w:p>
+      <w:pPr>
+        <w:pStyle w:val="ListBullet"/>
+      </w:pPr>
+      <w:r>
+        <w:t xml:space="preserve">Espace client société.</w:t>
+      </w:r>
+    </w:p>
+    <w:p>
+      <w:pPr>
+        <w:pStyle w:val="ListBullet"/>
+      </w:pPr>
+      <w:r>
+        <w:t xml:space="preserve">Dashboard admin / agent commercial.</w:t>
+      </w:r>
+    </w:p>
+    <w:p>
+      <w:pPr>
+        <w:pStyle w:val="ListBullet"/>
+      </w:pPr>
+      <w:r>
+        <w:t xml:space="preserve">Dashboard super root.</w:t>
+      </w:r>
+    </w:p>
+    <w:p>
+      <w:pPr>
+        <w:pStyle w:val="ListBullet"/>
+      </w:pPr>
+      <w:r>
+        <w:t xml:space="preserve">Espace fournisseur.</w:t>
+      </w:r>
+    </w:p>
+    <w:p>
+      <w:pPr>
+        <w:pStyle w:val="ListBullet"/>
+      </w:pPr>
+      <w:r>
+        <w:t xml:space="preserve">Documents Word et PowerPoint de présentation.</w:t>
       </w:r>
     </w:p>
     <w:p>
@@ -722,39 +799,47 @@
         <w:pStyle w:val="ListBullet"/>
       </w:pPr>
       <w:r>
-        <w:t xml:space="preserve">Client : société avec SIREN, TVA, adresse, contact.</w:t>
-      </w:r>
-    </w:p>
-    <w:p>
-      <w:pPr>
-        <w:pStyle w:val="ListBullet"/>
-      </w:pPr>
-      <w:r>
-        <w:t xml:space="preserve">Agent commercial : interne HB Commerce, limité à ses clients assignés.</w:t>
-      </w:r>
-    </w:p>
-    <w:p>
-      <w:pPr>
-        <w:pStyle w:val="ListBullet"/>
-      </w:pPr>
-      <w:r>
-        <w:t xml:space="preserve">Admin : interne HB Commerce, gère clients, agents, commandes, fournisseurs.</w:t>
-      </w:r>
-    </w:p>
-    <w:p>
-      <w:pPr>
-        <w:pStyle w:val="ListBullet"/>
-      </w:pPr>
-      <w:r>
-        <w:t xml:space="preserve">Super root : contrôle global, rôles, profils, prix, accès.</w:t>
-      </w:r>
-    </w:p>
-    <w:p>
-      <w:pPr>
-        <w:pStyle w:val="ListBullet"/>
-      </w:pPr>
-      <w:r>
-        <w:t xml:space="preserve">Fournisseur : accès fournisseur dédié, gestion stock et commandes reçues.</w:t>
+        <w:t xml:space="preserve">Société en attente : inscription en ligne en attente d’affectation.</w:t>
+      </w:r>
+    </w:p>
+    <w:p>
+      <w:pPr>
+        <w:pStyle w:val="ListBullet"/>
+      </w:pPr>
+      <w:r>
+        <w:t xml:space="preserve">Client : société acheteuse.</w:t>
+      </w:r>
+    </w:p>
+    <w:p>
+      <w:pPr>
+        <w:pStyle w:val="ListBullet"/>
+      </w:pPr>
+      <w:r>
+        <w:t xml:space="preserve">Fournisseur : société fournisseur avec espace stock.</w:t>
+      </w:r>
+    </w:p>
+    <w:p>
+      <w:pPr>
+        <w:pStyle w:val="ListBullet"/>
+      </w:pPr>
+      <w:r>
+        <w:t xml:space="preserve">Agent commercial : interne HB Commerce, portefeuille clients assignés.</w:t>
+      </w:r>
+    </w:p>
+    <w:p>
+      <w:pPr>
+        <w:pStyle w:val="ListBullet"/>
+      </w:pPr>
+      <w:r>
+        <w:t xml:space="preserve">Admin : interne HB Commerce, gestion opérationnelle.</w:t>
+      </w:r>
+    </w:p>
+    <w:p>
+      <w:pPr>
+        <w:pStyle w:val="ListBullet"/>
+      </w:pPr>
+      <w:r>
+        <w:t xml:space="preserve">Super root : gouvernance globale.</w:t>
       </w:r>
     </w:p>
     <w:p>
@@ -770,39 +855,55 @@
       </w:pPr>
       <w:r>
         <w:rPr/>
-        <w:t xml:space="preserve">4. Parcours client société</w:t>
-      </w:r>
-    </w:p>
-    <w:p>
-      <w:pPr>
-        <w:pStyle w:val="ListBullet"/>
-      </w:pPr>
-      <w:r>
-        <w:t xml:space="preserve">Inscription publique ou création par admin/super root.</w:t>
-      </w:r>
-    </w:p>
-    <w:p>
-      <w:pPr>
-        <w:pStyle w:val="ListBullet"/>
-      </w:pPr>
-      <w:r>
-        <w:t xml:space="preserve">Création client toujours avec rôle client.</w:t>
-      </w:r>
-    </w:p>
-    <w:p>
-      <w:pPr>
-        <w:pStyle w:val="ListBullet"/>
-      </w:pPr>
-      <w:r>
-        <w:t xml:space="preserve">Prix masqués hors connexion puis personnalisés après connexion.</w:t>
-      </w:r>
-    </w:p>
-    <w:p>
-      <w:pPr>
-        <w:pStyle w:val="ListBullet"/>
-      </w:pPr>
-      <w:r>
-        <w:t xml:space="preserve">Historique complet des commandes, y compris annulées et payées.</w:t>
+        <w:t xml:space="preserve">4. Création des sociétés et utilisateurs internes</w:t>
+      </w:r>
+    </w:p>
+    <w:p>
+      <w:pPr>
+        <w:pStyle w:val="ListBullet"/>
+      </w:pPr>
+      <w:r>
+        <w:t xml:space="preserve">Zone unique : Créer société client / fournisseur.</w:t>
+      </w:r>
+    </w:p>
+    <w:p>
+      <w:pPr>
+        <w:pStyle w:val="ListBullet"/>
+      </w:pPr>
+      <w:r>
+        <w:t xml:space="preserve">Une société peut être créée comme client ou fournisseur.</w:t>
+      </w:r>
+    </w:p>
+    <w:p>
+      <w:pPr>
+        <w:pStyle w:val="ListBullet"/>
+      </w:pPr>
+      <w:r>
+        <w:t xml:space="preserve">Une société inscrite en ligne reste en attente jusqu’à affectation par admin ou super root.</w:t>
+      </w:r>
+    </w:p>
+    <w:p>
+      <w:pPr>
+        <w:pStyle w:val="ListBullet"/>
+      </w:pPr>
+      <w:r>
+        <w:t xml:space="preserve">Zone séparée : Créer utilisateur interne HB Commerce.</w:t>
+      </w:r>
+    </w:p>
+    <w:p>
+      <w:pPr>
+        <w:pStyle w:val="ListBullet"/>
+      </w:pPr>
+      <w:r>
+        <w:t xml:space="preserve">Les utilisateurs internes agent/admin/super root ne demandent pas de société, SIREN, TVA ou adresse.</w:t>
+      </w:r>
+    </w:p>
+    <w:p>
+      <w:pPr>
+        <w:pStyle w:val="ListBullet"/>
+      </w:pPr>
+      <w:r>
+        <w:t xml:space="preserve">Un admin ne peut pas créer de super root.</w:t>
       </w:r>
     </w:p>
     <w:p>
@@ -818,47 +919,47 @@
       </w:pPr>
       <w:r>
         <w:rPr/>
-        <w:t xml:space="preserve">5. Agents commerciaux</w:t>
-      </w:r>
-    </w:p>
-    <w:p>
-      <w:pPr>
-        <w:pStyle w:val="ListBullet"/>
-      </w:pPr>
-      <w:r>
-        <w:t xml:space="preserve">Créés par admin ou super root.</w:t>
-      </w:r>
-    </w:p>
-    <w:p>
-      <w:pPr>
-        <w:pStyle w:val="ListBullet"/>
-      </w:pPr>
-      <w:r>
-        <w:t xml:space="preserve">Assignés à un ou plusieurs clients.</w:t>
-      </w:r>
-    </w:p>
-    <w:p>
-      <w:pPr>
-        <w:pStyle w:val="ListBullet"/>
-      </w:pPr>
-      <w:r>
-        <w:t xml:space="preserve">Valident et suivent les commandes de leurs clients.</w:t>
-      </w:r>
-    </w:p>
-    <w:p>
-      <w:pPr>
-        <w:pStyle w:val="ListBullet"/>
-      </w:pPr>
-      <w:r>
-        <w:t xml:space="preserve">Échangent via chat avec leurs clients.</w:t>
-      </w:r>
-    </w:p>
-    <w:p>
-      <w:pPr>
-        <w:pStyle w:val="ListBullet"/>
-      </w:pPr>
-      <w:r>
-        <w:t xml:space="preserve">Fixent les prix personnalisés pour leurs clients assignés.</w:t>
+        <w:t xml:space="preserve">5. Parcours client société</w:t>
+      </w:r>
+    </w:p>
+    <w:p>
+      <w:pPr>
+        <w:pStyle w:val="ListBullet"/>
+      </w:pPr>
+      <w:r>
+        <w:t xml:space="preserve">Inscription ou création back-office.</w:t>
+      </w:r>
+    </w:p>
+    <w:p>
+      <w:pPr>
+        <w:pStyle w:val="ListBullet"/>
+      </w:pPr>
+      <w:r>
+        <w:t xml:space="preserve">Affectation client par admin/super root.</w:t>
+      </w:r>
+    </w:p>
+    <w:p>
+      <w:pPr>
+        <w:pStyle w:val="ListBullet"/>
+      </w:pPr>
+      <w:r>
+        <w:t xml:space="preserve">Prix masqués hors connexion.</w:t>
+      </w:r>
+    </w:p>
+    <w:p>
+      <w:pPr>
+        <w:pStyle w:val="ListBullet"/>
+      </w:pPr>
+      <w:r>
+        <w:t xml:space="preserve">Prix personnalisés après connexion.</w:t>
+      </w:r>
+    </w:p>
+    <w:p>
+      <w:pPr>
+        <w:pStyle w:val="ListBullet"/>
+      </w:pPr>
+      <w:r>
+        <w:t xml:space="preserve">Historique complet et factures téléchargeables.</w:t>
       </w:r>
     </w:p>
     <w:p>
@@ -874,47 +975,39 @@
       </w:pPr>
       <w:r>
         <w:rPr/>
-        <w:t xml:space="preserve">6. Fournisseurs, stock et approvisionnement</w:t>
-      </w:r>
-    </w:p>
-    <w:p>
-      <w:pPr>
-        <w:pStyle w:val="ListBullet"/>
-      </w:pPr>
-      <w:r>
-        <w:t xml:space="preserve">Gestion des fournisseurs dans le dashboard admin/super root.</w:t>
-      </w:r>
-    </w:p>
-    <w:p>
-      <w:pPr>
-        <w:pStyle w:val="ListBullet"/>
-      </w:pPr>
-      <w:r>
-        <w:t xml:space="preserve">Chaque produit peut être rattaché à un fournisseur.</w:t>
-      </w:r>
-    </w:p>
-    <w:p>
-      <w:pPr>
-        <w:pStyle w:val="ListBullet"/>
-      </w:pPr>
-      <w:r>
-        <w:t xml:space="preserve">Un fournisseur peut avoir un compte supplier et accéder à supplier.html.</w:t>
-      </w:r>
-    </w:p>
-    <w:p>
-      <w:pPr>
-        <w:pStyle w:val="ListBullet"/>
-      </w:pPr>
-      <w:r>
-        <w:t xml:space="preserve">Le fournisseur met à jour stock, stock réservé et délai fournisseur.</w:t>
-      </w:r>
-    </w:p>
-    <w:p>
-      <w:pPr>
-        <w:pStyle w:val="ListBullet"/>
-      </w:pPr>
-      <w:r>
-        <w:t xml:space="preserve">HB Commerce crée des commandes d’approvisionnement vers les fournisseurs.</w:t>
+        <w:t xml:space="preserve">6. Agents commerciaux</w:t>
+      </w:r>
+    </w:p>
+    <w:p>
+      <w:pPr>
+        <w:pStyle w:val="ListBullet"/>
+      </w:pPr>
+      <w:r>
+        <w:t xml:space="preserve">Agent commercial assigné à un ou plusieurs clients.</w:t>
+      </w:r>
+    </w:p>
+    <w:p>
+      <w:pPr>
+        <w:pStyle w:val="ListBullet"/>
+      </w:pPr>
+      <w:r>
+        <w:t xml:space="preserve">Admin et super root sont assignables comme agents commerciaux par défaut.</w:t>
+      </w:r>
+    </w:p>
+    <w:p>
+      <w:pPr>
+        <w:pStyle w:val="ListBullet"/>
+      </w:pPr>
+      <w:r>
+        <w:t xml:space="preserve">L’agent voit uniquement ses clients assignés.</w:t>
+      </w:r>
+    </w:p>
+    <w:p>
+      <w:pPr>
+        <w:pStyle w:val="ListBullet"/>
+      </w:pPr>
+      <w:r>
+        <w:t xml:space="preserve">L’agent valide commandes, échange via chat et fixe les prix de ses clients.</w:t>
       </w:r>
     </w:p>
     <w:p>
@@ -930,23 +1023,79 @@
       </w:pPr>
       <w:r>
         <w:rPr/>
-        <w:t xml:space="preserve">7. Commandes, paiements, factures et livraison</w:t>
-      </w:r>
-    </w:p>
-    <w:p>
-      <w:pPr>
-        <w:pStyle w:val="ListBullet"/>
-      </w:pPr>
-      <w:r>
-        <w:t xml:space="preserve">Statuts commande : en cours de validation, validée, paiement à finaliser, payée, préparation, expédiée, livrée, annulée.</w:t>
-      </w:r>
-    </w:p>
-    <w:p>
-      <w:pPr>
-        <w:pStyle w:val="ListBullet"/>
-      </w:pPr>
-      <w:r>
-        <w:t xml:space="preserve">Facture téléchargeable par commande dans l’espace client.</w:t>
+        <w:t xml:space="preserve">7. Fournisseurs, stock et approvisionnement</w:t>
+      </w:r>
+    </w:p>
+    <w:p>
+      <w:pPr>
+        <w:pStyle w:val="ListBullet"/>
+      </w:pPr>
+      <w:r>
+        <w:t xml:space="preserve">Fiche fournisseur complète.</w:t>
+      </w:r>
+    </w:p>
+    <w:p>
+      <w:pPr>
+        <w:pStyle w:val="ListBullet"/>
+      </w:pPr>
+      <w:r>
+        <w:t xml:space="preserve">Compte fournisseur lié à supplier.html.</w:t>
+      </w:r>
+    </w:p>
+    <w:p>
+      <w:pPr>
+        <w:pStyle w:val="ListBullet"/>
+      </w:pPr>
+      <w:r>
+        <w:t xml:space="preserve">Stock par produit/fournisseur.</w:t>
+      </w:r>
+    </w:p>
+    <w:p>
+      <w:pPr>
+        <w:pStyle w:val="ListBullet"/>
+      </w:pPr>
+      <w:r>
+        <w:t xml:space="preserve">Stock réservé et délai fournisseur.</w:t>
+      </w:r>
+    </w:p>
+    <w:p>
+      <w:pPr>
+        <w:pStyle w:val="ListBullet"/>
+      </w:pPr>
+      <w:r>
+        <w:t xml:space="preserve">Commandes d’approvisionnement HB Commerce vers fournisseur.</w:t>
+      </w:r>
+    </w:p>
+    <w:p>
+      <w:pPr/>
+      <w:r>
+        <w:rPr/>
+        <w:t xml:space="preserve"/>
+      </w:r>
+    </w:p>
+    <w:p>
+      <w:pPr>
+        <w:pStyle w:val="Heading1"/>
+      </w:pPr>
+      <w:r>
+        <w:rPr/>
+        <w:t xml:space="preserve">8. Commandes, paiements, factures et livraison</w:t>
+      </w:r>
+    </w:p>
+    <w:p>
+      <w:pPr>
+        <w:pStyle w:val="ListBullet"/>
+      </w:pPr>
+      <w:r>
+        <w:t xml:space="preserve">Statuts : validation, paiement à finaliser, payée, annulée, préparation, expédiée, livrée.</w:t>
+      </w:r>
+    </w:p>
+    <w:p>
+      <w:pPr>
+        <w:pStyle w:val="ListBullet"/>
+      </w:pPr>
+      <w:r>
+        <w:t xml:space="preserve">Facture HTML téléchargeable depuis l’espace client.</w:t>
       </w:r>
     </w:p>
     <w:p>
@@ -962,7 +1111,7 @@
         <w:pStyle w:val="ListBullet"/>
       </w:pPr>
       <w:r>
-        <w:t xml:space="preserve">Le délai client dépend du stock disponible et du délai fournisseur.</w:t>
+        <w:t xml:space="preserve">Date estimée calculée selon stock et délais fournisseur.</w:t>
       </w:r>
     </w:p>
     <w:p>
@@ -978,7 +1127,7 @@
       </w:pPr>
       <w:r>
         <w:rPr/>
-        <w:t xml:space="preserve">8. Chat, modération et prix personnalisés</w:t>
+        <w:t xml:space="preserve">9. Chat, modération et prix personnalisés</w:t>
       </w:r>
     </w:p>
     <w:p>
@@ -994,7 +1143,7 @@
         <w:pStyle w:val="ListBullet"/>
       </w:pPr>
       <w:r>
-        <w:t xml:space="preserve">Commentaires clients validables/refusables.</w:t>
+        <w:t xml:space="preserve">Messages client validables/refusables.</w:t>
       </w:r>
     </w:p>
     <w:p>
@@ -1010,7 +1159,7 @@
         <w:pStyle w:val="ListBullet"/>
       </w:pPr>
       <w:r>
-        <w:t xml:space="preserve">Admin/super root/agent assigné peuvent fixer les prix selon leurs droits.</w:t>
+        <w:t xml:space="preserve">L’agent assigné peut fixer les prix de son portefeuille.</w:t>
       </w:r>
     </w:p>
     <w:p>
@@ -1026,23 +1175,23 @@
       </w:pPr>
       <w:r>
         <w:rPr/>
-        <w:t xml:space="preserve">9. Dashboards</w:t>
-      </w:r>
-    </w:p>
-    <w:p>
-      <w:pPr>
-        <w:pStyle w:val="ListBullet"/>
-      </w:pPr>
-      <w:r>
-        <w:t xml:space="preserve">super-root.html : gestion globale, rôles, profils, prix.</w:t>
-      </w:r>
-    </w:p>
-    <w:p>
-      <w:pPr>
-        <w:pStyle w:val="ListBullet"/>
-      </w:pPr>
-      <w:r>
-        <w:t xml:space="preserve">admin.html : produits, fournisseurs, clients, agents, commandes, chat, prix, livraison.</w:t>
+        <w:t xml:space="preserve">10. Dashboards</w:t>
+      </w:r>
+    </w:p>
+    <w:p>
+      <w:pPr>
+        <w:pStyle w:val="ListBullet"/>
+      </w:pPr>
+      <w:r>
+        <w:t xml:space="preserve">admin.html : opérations, clients/fournisseurs, agents, commandes, chat, prix, livraison.</w:t>
+      </w:r>
+    </w:p>
+    <w:p>
+      <w:pPr>
+        <w:pStyle w:val="ListBullet"/>
+      </w:pPr>
+      <w:r>
+        <w:t xml:space="preserve">super-root.html : rôles, profils, prix, accès.</w:t>
       </w:r>
     </w:p>
     <w:p>
@@ -1074,39 +1223,47 @@
       </w:pPr>
       <w:r>
         <w:rPr/>
-        <w:t xml:space="preserve">10. Données Supabase et sécurité</w:t>
-      </w:r>
-    </w:p>
-    <w:p>
-      <w:pPr>
-        <w:pStyle w:val="ListBullet"/>
-      </w:pPr>
-      <w:r>
-        <w:t xml:space="preserve">RLS Supabase pour isoler client, fournisseur et agent.</w:t>
-      </w:r>
-    </w:p>
-    <w:p>
-      <w:pPr>
-        <w:pStyle w:val="ListBullet"/>
-      </w:pPr>
-      <w:r>
-        <w:t xml:space="preserve">commercial_agent_id limite l’agent à ses clients.</w:t>
-      </w:r>
-    </w:p>
-    <w:p>
-      <w:pPr>
-        <w:pStyle w:val="ListBullet"/>
-      </w:pPr>
-      <w:r>
-        <w:t xml:space="preserve">supplier_id relie fournisseur et produits/stock.</w:t>
-      </w:r>
-    </w:p>
-    <w:p>
-      <w:pPr>
-        <w:pStyle w:val="ListBullet"/>
-      </w:pPr>
-      <w:r>
-        <w:t xml:space="preserve">Migrations SQL documentées dans le dossier supabase.</w:t>
+        <w:t xml:space="preserve">11. Données Supabase et sécurité</w:t>
+      </w:r>
+    </w:p>
+    <w:p>
+      <w:pPr>
+        <w:pStyle w:val="ListBullet"/>
+      </w:pPr>
+      <w:r>
+        <w:t xml:space="preserve">Supabase Auth pour comptes.</w:t>
+      </w:r>
+    </w:p>
+    <w:p>
+      <w:pPr>
+        <w:pStyle w:val="ListBullet"/>
+      </w:pPr>
+      <w:r>
+        <w:t xml:space="preserve">RLS par rôle.</w:t>
+      </w:r>
+    </w:p>
+    <w:p>
+      <w:pPr>
+        <w:pStyle w:val="ListBullet"/>
+      </w:pPr>
+      <w:r>
+        <w:t xml:space="preserve">commercial_agent_id pour limiter agents.</w:t>
+      </w:r>
+    </w:p>
+    <w:p>
+      <w:pPr>
+        <w:pStyle w:val="ListBullet"/>
+      </w:pPr>
+      <w:r>
+        <w:t xml:space="preserve">supplier_id pour lier fournisseurs.</w:t>
+      </w:r>
+    </w:p>
+    <w:p>
+      <w:pPr>
+        <w:pStyle w:val="ListBullet"/>
+      </w:pPr>
+      <w:r>
+        <w:t xml:space="preserve">Migrations SQL versionnées.</w:t>
       </w:r>
     </w:p>
     <w:p>
@@ -1122,39 +1279,39 @@
       </w:pPr>
       <w:r>
         <w:rPr/>
-        <w:t xml:space="preserve">11. Migrations et déploiement</w:t>
-      </w:r>
-    </w:p>
-    <w:p>
-      <w:pPr>
-        <w:pStyle w:val="ListBullet"/>
-      </w:pPr>
-      <w:r>
-        <w:t xml:space="preserve">Déploiement frontend : GitHub Pages.</w:t>
-      </w:r>
-    </w:p>
-    <w:p>
-      <w:pPr>
-        <w:pStyle w:val="ListBullet"/>
-      </w:pPr>
-      <w:r>
-        <w:t xml:space="preserve">Backend : Supabase SQL Editor pour migrations.</w:t>
-      </w:r>
-    </w:p>
-    <w:p>
-      <w:pPr>
-        <w:pStyle w:val="ListBullet"/>
-      </w:pPr>
-      <w:r>
-        <w:t xml:space="preserve">Configurer Auth Redirect URLs vers GitHub Pages.</w:t>
-      </w:r>
-    </w:p>
-    <w:p>
-      <w:pPr>
-        <w:pStyle w:val="ListBullet"/>
-      </w:pPr>
-      <w:r>
-        <w:t xml:space="preserve">Promouvoir le compte principal en super_root après migration.</w:t>
+        <w:t xml:space="preserve">12. Migrations et déploiement</w:t>
+      </w:r>
+    </w:p>
+    <w:p>
+      <w:pPr>
+        <w:pStyle w:val="ListBullet"/>
+      </w:pPr>
+      <w:r>
+        <w:t xml:space="preserve">Frontend GitHub Pages.</w:t>
+      </w:r>
+    </w:p>
+    <w:p>
+      <w:pPr>
+        <w:pStyle w:val="ListBullet"/>
+      </w:pPr>
+      <w:r>
+        <w:t xml:space="preserve">Migrations SQL dans Supabase SQL Editor.</w:t>
+      </w:r>
+    </w:p>
+    <w:p>
+      <w:pPr>
+        <w:pStyle w:val="ListBullet"/>
+      </w:pPr>
+      <w:r>
+        <w:t xml:space="preserve">URLs Auth configurées vers GitHub Pages.</w:t>
+      </w:r>
+    </w:p>
+    <w:p>
+      <w:pPr>
+        <w:pStyle w:val="ListBullet"/>
+      </w:pPr>
+      <w:r>
+        <w:t xml:space="preserve">Compte super root initial via SQL contrôlé.</w:t>
       </w:r>
     </w:p>
     <w:p>
@@ -1170,55 +1327,63 @@
       </w:pPr>
       <w:r>
         <w:rPr/>
-        <w:t xml:space="preserve">12. Critères d’acceptation</w:t>
-      </w:r>
-    </w:p>
-    <w:p>
-      <w:pPr>
-        <w:pStyle w:val="ListBullet"/>
-      </w:pPr>
-      <w:r>
-        <w:t xml:space="preserve">Un client créé est toujours client.</w:t>
-      </w:r>
-    </w:p>
-    <w:p>
-      <w:pPr>
-        <w:pStyle w:val="ListBullet"/>
-      </w:pPr>
-      <w:r>
-        <w:t xml:space="preserve">Admin ne peut pas créer de super root.</w:t>
-      </w:r>
-    </w:p>
-    <w:p>
-      <w:pPr>
-        <w:pStyle w:val="ListBullet"/>
-      </w:pPr>
-      <w:r>
-        <w:t xml:space="preserve">Agent ne voit que ses clients.</w:t>
-      </w:r>
-    </w:p>
-    <w:p>
-      <w:pPr>
-        <w:pStyle w:val="ListBullet"/>
-      </w:pPr>
-      <w:r>
-        <w:t xml:space="preserve">Fournisseur ne voit que son espace et son stock.</w:t>
-      </w:r>
-    </w:p>
-    <w:p>
-      <w:pPr>
-        <w:pStyle w:val="ListBullet"/>
-      </w:pPr>
-      <w:r>
-        <w:t xml:space="preserve">Facture téléchargeable depuis chaque commande.</w:t>
-      </w:r>
-    </w:p>
-    <w:p>
-      <w:pPr>
-        <w:pStyle w:val="ListBullet"/>
-      </w:pPr>
-      <w:r>
-        <w:t xml:space="preserve">Livraison et dates de suivi visibles côté client.</w:t>
+        <w:t xml:space="preserve">13. Critères d’acceptation</w:t>
+      </w:r>
+    </w:p>
+    <w:p>
+      <w:pPr>
+        <w:pStyle w:val="ListBullet"/>
+      </w:pPr>
+      <w:r>
+        <w:t xml:space="preserve">Société inscrite en ligne en attente.</w:t>
+      </w:r>
+    </w:p>
+    <w:p>
+      <w:pPr>
+        <w:pStyle w:val="ListBullet"/>
+      </w:pPr>
+      <w:r>
+        <w:t xml:space="preserve">Admin/super root affecte client ou fournisseur.</w:t>
+      </w:r>
+    </w:p>
+    <w:p>
+      <w:pPr>
+        <w:pStyle w:val="ListBullet"/>
+      </w:pPr>
+      <w:r>
+        <w:t xml:space="preserve">Création utilisateur interne sans champs société.</w:t>
+      </w:r>
+    </w:p>
+    <w:p>
+      <w:pPr>
+        <w:pStyle w:val="ListBullet"/>
+      </w:pPr>
+      <w:r>
+        <w:t xml:space="preserve">Admin ne crée pas de super root.</w:t>
+      </w:r>
+    </w:p>
+    <w:p>
+      <w:pPr>
+        <w:pStyle w:val="ListBullet"/>
+      </w:pPr>
+      <w:r>
+        <w:t xml:space="preserve">Fournisseur gère son stock.</w:t>
+      </w:r>
+    </w:p>
+    <w:p>
+      <w:pPr>
+        <w:pStyle w:val="ListBullet"/>
+      </w:pPr>
+      <w:r>
+        <w:t xml:space="preserve">Client télécharge ses factures.</w:t>
+      </w:r>
+    </w:p>
+    <w:p>
+      <w:pPr>
+        <w:pStyle w:val="ListBullet"/>
+      </w:pPr>
+      <w:r>
+        <w:t xml:space="preserve">Livraison suivie et datée.</w:t>
       </w:r>
     </w:p>
     <w:p>

</xml_diff>